<commit_message>
Add 2부 1–16화 Milano scripts (complete part 2, 100 turns each, pre-20th-century quotations)
Co-Authored-By: Claude Sonnet 5.5 <noreply@anthropic.com>
Claude-Session: https://claude.ai/code/session_01WyxyqRkqEq9dNr3RKGdFPu
</commit_message>
<xml_diff>
--- a/milano/2부8화_Italiani_si_diventa.docx
+++ b/milano/2부8화_Italiani_si_diventa.docx
@@ -88,7 +88,7 @@
           <w:b w:val="0"/>
           <w:sz w:val="21"/>
         </w:rPr>
-        <w:t>밀라노, 브레라 Libreria Ferri · 2월 첫째 목요일 저녁</w:t>
+        <w:t>밀라노, 브레라 Libreria Ferri · 1월 넷째 목요일 저녁</w:t>
       </w:r>
     </w:p>
     <w:p>
@@ -2894,7 +2894,7 @@
           <w:b w:val="0"/>
           <w:sz w:val="21"/>
         </w:rPr>
-        <w:t>Ma prima un annuncio: sabato c'è il sabato grasso, il Carnevale ambrosiano. Chi vuole venire in piazza con noi?</w:t>
+        <w:t>Ma prima un annuncio: tra due settimane c'è il sabato grasso, il Carnevale ambrosiano. Chi vuole venire in piazza con noi?</w:t>
       </w:r>
     </w:p>
     <w:p>
@@ -3039,7 +3039,7 @@
           <w:b w:val="0"/>
           <w:sz w:val="21"/>
         </w:rPr>
-        <w:t>Anna, tu vieni sabato?</w:t>
+        <w:t>Anna, tu vieni al sabato grasso?</w:t>
       </w:r>
     </w:p>
     <w:p>

</xml_diff>